<commit_message>
added vertrags type filter in dashboard to further expand into TV and DSL contracts
</commit_message>
<xml_diff>
--- a/backend/data/Kündigung nach TKG Yourfone.docx
+++ b/backend/data/Kündigung nach TKG Yourfone.docx
@@ -1019,7 +1019,7 @@
         <w:rPr>
           <w:rFonts w:ascii="Calibri" w:hAnsi="Calibri" w:cs="Calibri"/>
         </w:rPr>
-        <w:t>1</w:t>
+        <w:t>2</w:t>
       </w:r>
       <w:r>
         <w:rPr>
@@ -1099,7 +1099,31 @@
         <w:rPr>
           <w:rFonts w:ascii="Calibri" w:hAnsi="Calibri" w:cs="Calibri"/>
         </w:rPr>
-        <w:t>"],</w:t>
+        <w:t>"</w:t>
+      </w:r>
+      <w:r>
+        <w:rPr>
+          <w:rFonts w:ascii="Calibri" w:hAnsi="Calibri" w:cs="Calibri"/>
+        </w:rPr>
+        <w:t>,"</w:t>
+      </w:r>
+      <w:r>
+        <w:rPr>
+          <w:rFonts w:ascii="Calibri" w:hAnsi="Calibri" w:cs="Calibri"/>
+        </w:rPr>
+        <w:t>Mobilfunk</w:t>
+      </w:r>
+      <w:r>
+        <w:rPr>
+          <w:rFonts w:ascii="Calibri" w:hAnsi="Calibri" w:cs="Calibri"/>
+        </w:rPr>
+        <w:t>"</w:t>
+      </w:r>
+      <w:r>
+        <w:rPr>
+          <w:rFonts w:ascii="Calibri" w:hAnsi="Calibri" w:cs="Calibri"/>
+        </w:rPr>
+        <w:t>],</w:t>
       </w:r>
     </w:p>
     <w:p>
@@ -1131,6 +1155,31 @@
           <w:rFonts w:ascii="Calibri" w:hAnsi="Calibri" w:cs="Calibri"/>
         </w:rPr>
         <w:t>"]</w:t>
+      </w:r>
+      <w:r>
+        <w:rPr>
+          <w:rFonts w:ascii="Calibri" w:hAnsi="Calibri" w:cs="Calibri"/>
+        </w:rPr>
+        <w:t>,</w:t>
+      </w:r>
+    </w:p>
+    <w:p>
+      <w:pPr>
+        <w:rPr>
+          <w:rFonts w:ascii="Calibri" w:hAnsi="Calibri" w:cs="Calibri"/>
+        </w:rPr>
+      </w:pPr>
+      <w:r>
+        <w:rPr>
+          <w:rFonts w:ascii="Calibri" w:hAnsi="Calibri" w:cs="Calibri"/>
+        </w:rPr>
+        <w:t xml:space="preserve">            </w:t>
+      </w:r>
+      <w:r>
+        <w:rPr>
+          <w:rFonts w:ascii="Calibri" w:hAnsi="Calibri" w:cs="Calibri"/>
+        </w:rPr>
+        <w:t>"vertragstyp":["Mobilfunk"]</w:t>
       </w:r>
     </w:p>
     <w:p>
@@ -1195,7 +1244,13 @@
         <w:rPr>
           <w:rFonts w:ascii="Calibri" w:hAnsi="Calibri" w:cs="Calibri"/>
         </w:rPr>
-        <w:t xml:space="preserve">                ["Vorname","Name"],</w:t>
+        <w:t xml:space="preserve">                </w:t>
+      </w:r>
+      <w:r>
+        <w:rPr>
+          <w:rFonts w:ascii="Calibri" w:hAnsi="Calibri" w:cs="Calibri"/>
+        </w:rPr>
+        <w:t>["Vorname","Name"],</w:t>
       </w:r>
     </w:p>
     <w:p>

</xml_diff>